<commit_message>
update on configure page
</commit_message>
<xml_diff>
--- a/tests/user_sample/range_tests/split_3_5.docx
+++ b/tests/user_sample/range_tests/split_3_5.docx
@@ -1138,6 +1138,607 @@
           <w:lang w:val="en-US" w:eastAsia="en-US" w:bidi="ar-SA"/>
         </w:rPr>
         <w:t>04a_20210033_Scout_Clinical_Comunicacao_email_v2_18Out2024.pdf</w:t>
+      </w:r>
+    </w:p>
+    <w:p>
+      <w:pPr>
+        <w:pageBreakBefore/>
+        <w:widowControl/>
+        <w:numPr>
+          <w:ilvl w:val="1"/>
+          <w:numId w:val="1"/>
+        </w:numPr>
+        <w:ind w:left="790"/>
+        <w:rPr>
+          <w:rFonts w:ascii="Calibri" w:eastAsia="Calibri" w:hAnsi="Calibri" w:cs="Calibri"/>
+          <w:color w:val="auto"/>
+          <w:sz w:val="22"/>
+          <w:szCs w:val="22"/>
+          <w:lang w:val="en-US" w:eastAsia="en-US" w:bidi="ar-SA"/>
+        </w:rPr>
+      </w:pPr>
+      <w:r>
+        <w:rPr>
+          <w:rFonts w:ascii="Calibri" w:eastAsia="Calibri" w:hAnsi="Calibri" w:cs="Calibri"/>
+          <w:color w:val="auto"/>
+          <w:sz w:val="22"/>
+          <w:szCs w:val="22"/>
+          <w:lang w:val="en-US" w:eastAsia="en-US" w:bidi="ar-SA"/>
+        </w:rPr>
+        <w:lastRenderedPageBreak/>
+        <w:t>04b_20210033_Scout_Clinical_Brochura_Estudo_v2_18Out2024.pdf</w:t>
+      </w:r>
+    </w:p>
+    <w:p>
+      <w:pPr>
+        <w:widowControl/>
+        <w:numPr>
+          <w:ilvl w:val="1"/>
+          <w:numId w:val="1"/>
+        </w:numPr>
+        <w:spacing w:before="40"/>
+        <w:ind w:left="790"/>
+        <w:rPr>
+          <w:rFonts w:ascii="Calibri" w:eastAsia="Calibri" w:hAnsi="Calibri" w:cs="Calibri"/>
+          <w:color w:val="auto"/>
+          <w:sz w:val="22"/>
+          <w:szCs w:val="22"/>
+          <w:lang w:eastAsia="en-US" w:bidi="ar-SA"/>
+        </w:rPr>
+      </w:pPr>
+      <w:r>
+        <w:rPr>
+          <w:rFonts w:ascii="Calibri" w:eastAsia="Calibri" w:hAnsi="Calibri" w:cs="Calibri"/>
+          <w:color w:val="auto"/>
+          <w:sz w:val="22"/>
+          <w:szCs w:val="22"/>
+          <w:lang w:eastAsia="en-US" w:bidi="ar-SA"/>
+        </w:rPr>
+        <w:t>05a_20210033_Centros_participantes_no_Brasil_v6_13Abr2026.pdf</w:t>
+      </w:r>
+    </w:p>
+    <w:p>
+      <w:pPr>
+        <w:widowControl/>
+        <w:numPr>
+          <w:ilvl w:val="1"/>
+          <w:numId w:val="1"/>
+        </w:numPr>
+        <w:spacing w:before="40"/>
+        <w:ind w:left="790"/>
+        <w:rPr>
+          <w:rFonts w:ascii="Calibri" w:eastAsia="Calibri" w:hAnsi="Calibri" w:cs="Calibri"/>
+          <w:color w:val="auto"/>
+          <w:sz w:val="22"/>
+          <w:szCs w:val="22"/>
+          <w:lang w:eastAsia="en-US" w:bidi="ar-SA"/>
+        </w:rPr>
+      </w:pPr>
+      <w:r>
+        <w:rPr>
+          <w:rFonts w:ascii="Calibri" w:eastAsia="Calibri" w:hAnsi="Calibri" w:cs="Calibri"/>
+          <w:color w:val="auto"/>
+          <w:sz w:val="22"/>
+          <w:szCs w:val="22"/>
+          <w:lang w:eastAsia="en-US" w:bidi="ar-SA"/>
+        </w:rPr>
+        <w:t>05b_20210033_CV_Maira_Silva_Abreu_08maio2024.pdf</w:t>
+      </w:r>
+    </w:p>
+    <w:p>
+      <w:pPr>
+        <w:widowControl/>
+        <w:numPr>
+          <w:ilvl w:val="1"/>
+          <w:numId w:val="1"/>
+        </w:numPr>
+        <w:ind w:left="790"/>
+        <w:rPr>
+          <w:rFonts w:ascii="Calibri" w:eastAsia="Calibri" w:hAnsi="Calibri" w:cs="Calibri"/>
+          <w:color w:val="auto"/>
+          <w:sz w:val="22"/>
+          <w:szCs w:val="22"/>
+          <w:lang w:eastAsia="en-US" w:bidi="ar-SA"/>
+        </w:rPr>
+      </w:pPr>
+      <w:r>
+        <w:rPr>
+          <w:rFonts w:ascii="Calibri" w:eastAsia="Calibri" w:hAnsi="Calibri" w:cs="Calibri"/>
+          <w:color w:val="auto"/>
+          <w:sz w:val="22"/>
+          <w:szCs w:val="22"/>
+          <w:lang w:eastAsia="en-US" w:bidi="ar-SA"/>
+        </w:rPr>
+        <w:t>05c_20210033_Justificativa_Mudanca_PI_Centro_93314024_19Fev2026.pdf</w:t>
+      </w:r>
+    </w:p>
+    <w:p>
+      <w:pPr>
+        <w:widowControl/>
+        <w:numPr>
+          <w:ilvl w:val="1"/>
+          <w:numId w:val="1"/>
+        </w:numPr>
+        <w:ind w:left="790" w:right="1449"/>
+        <w:rPr>
+          <w:rFonts w:ascii="Calibri" w:eastAsia="Calibri" w:hAnsi="Calibri" w:cs="Calibri"/>
+          <w:color w:val="auto"/>
+          <w:sz w:val="22"/>
+          <w:szCs w:val="22"/>
+          <w:lang w:eastAsia="en-US" w:bidi="ar-SA"/>
+        </w:rPr>
+      </w:pPr>
+      <w:r>
+        <w:rPr>
+          <w:rFonts w:ascii="Calibri" w:eastAsia="Calibri" w:hAnsi="Calibri" w:cs="Calibri"/>
+          <w:color w:val="auto"/>
+          <w:sz w:val="22"/>
+          <w:szCs w:val="22"/>
+          <w:lang w:eastAsia="en-US" w:bidi="ar-SA"/>
+        </w:rPr>
+        <w:t>05d_20210033_Carta_encaminhamento_CEP_Mudanca_PI_Centro_93314024_19Fev2026.pdf</w:t>
+      </w:r>
+    </w:p>
+    <w:p>
+      <w:pPr>
+        <w:widowControl/>
+        <w:numPr>
+          <w:ilvl w:val="1"/>
+          <w:numId w:val="1"/>
+        </w:numPr>
+        <w:spacing w:before="40"/>
+        <w:ind w:left="790"/>
+        <w:rPr>
+          <w:rFonts w:ascii="Calibri" w:eastAsia="Calibri" w:hAnsi="Calibri" w:cs="Calibri"/>
+          <w:color w:val="auto"/>
+          <w:sz w:val="22"/>
+          <w:szCs w:val="22"/>
+          <w:lang w:eastAsia="en-US" w:bidi="ar-SA"/>
+        </w:rPr>
+      </w:pPr>
+      <w:r>
+        <w:rPr>
+          <w:rFonts w:ascii="Calibri" w:eastAsia="Calibri" w:hAnsi="Calibri" w:cs="Calibri"/>
+          <w:color w:val="auto"/>
+          <w:sz w:val="22"/>
+          <w:szCs w:val="22"/>
+          <w:lang w:eastAsia="en-US" w:bidi="ar-SA"/>
+        </w:rPr>
+        <w:t>05e_20210033_Aceite_Notificacao_CEP_Mudanca_PI_Centro_93314024_19Fev2026.pdf</w:t>
+      </w:r>
+    </w:p>
+    <w:p>
+      <w:pPr>
+        <w:widowControl/>
+        <w:numPr>
+          <w:ilvl w:val="1"/>
+          <w:numId w:val="1"/>
+        </w:numPr>
+        <w:spacing w:before="40"/>
+        <w:ind w:left="790"/>
+        <w:rPr>
+          <w:rFonts w:ascii="Calibri" w:eastAsia="Calibri" w:hAnsi="Calibri" w:cs="Calibri"/>
+          <w:color w:val="auto"/>
+          <w:sz w:val="22"/>
+          <w:szCs w:val="22"/>
+          <w:lang w:eastAsia="en-US" w:bidi="ar-SA"/>
+        </w:rPr>
+      </w:pPr>
+      <w:r>
+        <w:rPr>
+          <w:rFonts w:ascii="Calibri" w:eastAsia="Calibri" w:hAnsi="Calibri" w:cs="Calibri"/>
+          <w:color w:val="auto"/>
+          <w:sz w:val="22"/>
+          <w:szCs w:val="22"/>
+          <w:lang w:eastAsia="en-US" w:bidi="ar-SA"/>
+        </w:rPr>
+        <w:t>05f_20210033_Relatorio_Andamento_Estudo_Centro_93314024_24Fev2026.pdf</w:t>
+      </w:r>
+    </w:p>
+    <w:p>
+      <w:pPr>
+        <w:widowControl/>
+        <w:numPr>
+          <w:ilvl w:val="1"/>
+          <w:numId w:val="1"/>
+        </w:numPr>
+        <w:ind w:left="790" w:right="1395"/>
+        <w:rPr>
+          <w:rFonts w:ascii="Calibri" w:eastAsia="Calibri" w:hAnsi="Calibri" w:cs="Calibri"/>
+          <w:color w:val="auto"/>
+          <w:sz w:val="22"/>
+          <w:szCs w:val="22"/>
+          <w:lang w:eastAsia="en-US" w:bidi="ar-SA"/>
+        </w:rPr>
+      </w:pPr>
+      <w:r>
+        <w:rPr>
+          <w:rFonts w:ascii="Calibri" w:eastAsia="Calibri" w:hAnsi="Calibri" w:cs="Calibri"/>
+          <w:color w:val="auto"/>
+          <w:sz w:val="22"/>
+          <w:szCs w:val="22"/>
+          <w:lang w:eastAsia="en-US" w:bidi="ar-SA"/>
+        </w:rPr>
+        <w:t>06a_20210033_Cronograma_do_estudo_e_paises_participantes_13Abr2026_AltDestacadas.pdf</w:t>
+      </w:r>
+    </w:p>
+    <w:p>
+      <w:pPr>
+        <w:widowControl/>
+        <w:numPr>
+          <w:ilvl w:val="1"/>
+          <w:numId w:val="1"/>
+        </w:numPr>
+        <w:spacing w:before="20"/>
+        <w:ind w:left="790"/>
+        <w:rPr>
+          <w:rFonts w:ascii="Times New Roman" w:eastAsia="Times New Roman" w:hAnsi="Times New Roman" w:cs="Times New Roman"/>
+          <w:color w:val="auto"/>
+          <w:sz w:val="20"/>
+          <w:szCs w:val="20"/>
+          <w:lang w:eastAsia="en-US" w:bidi="ar-SA"/>
+        </w:rPr>
+      </w:pPr>
+      <w:r>
+        <w:rPr>
+          <w:rFonts w:ascii="Calibri" w:eastAsia="Calibri" w:hAnsi="Calibri" w:cs="Calibri"/>
+          <w:color w:val="auto"/>
+          <w:sz w:val="22"/>
+          <w:szCs w:val="22"/>
+          <w:lang w:eastAsia="en-US" w:bidi="ar-SA"/>
+        </w:rPr>
+        <w:t>06a_20210033_Cronograma_do_estudo</w:t>
+      </w:r>
+      <w:r>
+        <w:rPr>
+          <w:rFonts w:ascii="Calibri" w:eastAsia="Calibri" w:hAnsi="Calibri" w:cs="Calibri"/>
+          <w:color w:val="auto"/>
+          <w:sz w:val="22"/>
+          <w:szCs w:val="22"/>
+          <w:lang w:eastAsia="en-US" w:bidi="ar-SA"/>
+        </w:rPr>
+        <w:t>_e_paises_participantes_13Abr2026_Limpo.pdf</w:t>
+      </w:r>
+    </w:p>
+    <w:p>
+      <w:pPr>
+        <w:widowControl/>
+        <w:spacing w:before="800" w:line="314" w:lineRule="auto"/>
+        <w:ind w:right="936" w:firstLine="711"/>
+        <w:rPr>
+          <w:rFonts w:ascii="Times New Roman" w:eastAsia="Times New Roman" w:hAnsi="Times New Roman" w:cs="Times New Roman"/>
+          <w:color w:val="auto"/>
+          <w:sz w:val="20"/>
+          <w:szCs w:val="20"/>
+          <w:lang w:eastAsia="en-US" w:bidi="ar-SA"/>
+        </w:rPr>
+      </w:pPr>
+      <w:r>
+        <w:rPr>
+          <w:rFonts w:ascii="Calibri" w:eastAsia="Calibri" w:hAnsi="Calibri" w:cs="Calibri"/>
+          <w:b/>
+          <w:bCs/>
+          <w:color w:val="auto"/>
+          <w:sz w:val="22"/>
+          <w:szCs w:val="22"/>
+          <w:lang w:eastAsia="en-US" w:bidi="ar-SA"/>
+        </w:rPr>
+        <w:t>Na Plataforma Brasil, serão realizadas as seguintes alterações em relação aos assistentes de pesquisa:</w:t>
+      </w:r>
+    </w:p>
+    <w:p>
+      <w:pPr>
+        <w:widowControl/>
+        <w:numPr>
+          <w:ilvl w:val="0"/>
+          <w:numId w:val="3"/>
+        </w:numPr>
+        <w:spacing w:before="80"/>
+        <w:ind w:left="1071" w:hanging="356"/>
+        <w:rPr>
+          <w:rFonts w:ascii="Times New Roman" w:eastAsia="Times New Roman" w:hAnsi="Times New Roman" w:cs="Times New Roman"/>
+          <w:b/>
+          <w:bCs/>
+          <w:color w:val="auto"/>
+          <w:sz w:val="20"/>
+          <w:szCs w:val="20"/>
+          <w:lang w:val="en-US" w:eastAsia="en-US" w:bidi="ar-SA"/>
+        </w:rPr>
+      </w:pPr>
+      <w:r>
+        <w:rPr>
+          <w:rFonts w:ascii="Calibri" w:eastAsia="Calibri" w:hAnsi="Calibri" w:cs="Calibri"/>
+          <w:b/>
+          <w:bCs/>
+          <w:color w:val="auto"/>
+          <w:sz w:val="22"/>
+          <w:szCs w:val="22"/>
+          <w:lang w:val="en-US" w:eastAsia="en-US" w:bidi="ar-SA"/>
+        </w:rPr>
+        <w:t>Inclusão:</w:t>
+      </w:r>
+    </w:p>
+    <w:p>
+      <w:pPr>
+        <w:widowControl/>
+        <w:numPr>
+          <w:ilvl w:val="1"/>
+          <w:numId w:val="1"/>
+        </w:numPr>
+        <w:spacing w:before="100"/>
+        <w:ind w:left="1810"/>
+        <w:rPr>
+          <w:rFonts w:ascii="Times New Roman" w:eastAsia="Times New Roman" w:hAnsi="Times New Roman" w:cs="Times New Roman"/>
+          <w:color w:val="auto"/>
+          <w:sz w:val="20"/>
+          <w:szCs w:val="20"/>
+          <w:lang w:val="en-US" w:eastAsia="en-US" w:bidi="ar-SA"/>
+        </w:rPr>
+      </w:pPr>
+      <w:r>
+        <w:rPr>
+          <w:rFonts w:ascii="Calibri" w:eastAsia="Calibri" w:hAnsi="Calibri" w:cs="Calibri"/>
+          <w:color w:val="auto"/>
+          <w:sz w:val="22"/>
+          <w:szCs w:val="22"/>
+          <w:lang w:val="en-US" w:eastAsia="en-US" w:bidi="ar-SA"/>
+        </w:rPr>
+        <w:t>Alisson Quadros Weymer</w:t>
+      </w:r>
+    </w:p>
+    <w:p>
+      <w:pPr>
+        <w:widowControl/>
+        <w:numPr>
+          <w:ilvl w:val="1"/>
+          <w:numId w:val="1"/>
+        </w:numPr>
+        <w:spacing w:before="140"/>
+        <w:ind w:left="1810"/>
+        <w:rPr>
+          <w:rFonts w:ascii="Times New Roman" w:eastAsia="Times New Roman" w:hAnsi="Times New Roman" w:cs="Times New Roman"/>
+          <w:color w:val="auto"/>
+          <w:sz w:val="20"/>
+          <w:szCs w:val="20"/>
+          <w:lang w:val="en-US" w:eastAsia="en-US" w:bidi="ar-SA"/>
+        </w:rPr>
+      </w:pPr>
+      <w:r>
+        <w:rPr>
+          <w:rFonts w:ascii="Calibri" w:eastAsia="Calibri" w:hAnsi="Calibri" w:cs="Calibri"/>
+          <w:color w:val="auto"/>
+          <w:sz w:val="22"/>
+          <w:szCs w:val="22"/>
+          <w:lang w:val="en-US" w:eastAsia="en-US" w:bidi="ar-SA"/>
+        </w:rPr>
+        <w:t>Luiza Beatriz Simas</w:t>
+      </w:r>
+    </w:p>
+    <w:p>
+      <w:pPr>
+        <w:widowControl/>
+        <w:numPr>
+          <w:ilvl w:val="1"/>
+          <w:numId w:val="1"/>
+        </w:numPr>
+        <w:spacing w:before="100"/>
+        <w:ind w:left="1810"/>
+        <w:rPr>
+          <w:rFonts w:ascii="Times New Roman" w:eastAsia="Times New Roman" w:hAnsi="Times New Roman" w:cs="Times New Roman"/>
+          <w:color w:val="auto"/>
+          <w:sz w:val="20"/>
+          <w:szCs w:val="20"/>
+          <w:lang w:val="en-US" w:eastAsia="en-US" w:bidi="ar-SA"/>
+        </w:rPr>
+      </w:pPr>
+      <w:r>
+        <w:rPr>
+          <w:rFonts w:ascii="Calibri" w:eastAsia="Calibri" w:hAnsi="Calibri" w:cs="Calibri"/>
+          <w:color w:val="auto"/>
+          <w:sz w:val="22"/>
+          <w:szCs w:val="22"/>
+          <w:lang w:val="en-US" w:eastAsia="en-US" w:bidi="ar-SA"/>
+        </w:rPr>
+        <w:t>Nicolly Inacio de Jesus</w:t>
+      </w:r>
+    </w:p>
+    <w:p>
+      <w:pPr>
+        <w:widowControl/>
+        <w:numPr>
+          <w:ilvl w:val="1"/>
+          <w:numId w:val="1"/>
+        </w:numPr>
+        <w:spacing w:before="140"/>
+        <w:ind w:left="1810"/>
+        <w:rPr>
+          <w:rFonts w:ascii="Times New Roman" w:eastAsia="Times New Roman" w:hAnsi="Times New Roman" w:cs="Times New Roman"/>
+          <w:color w:val="auto"/>
+          <w:sz w:val="20"/>
+          <w:szCs w:val="20"/>
+          <w:lang w:val="en-US" w:eastAsia="en-US" w:bidi="ar-SA"/>
+        </w:rPr>
+      </w:pPr>
+      <w:r>
+        <w:rPr>
+          <w:rFonts w:ascii="Calibri" w:eastAsia="Calibri" w:hAnsi="Calibri" w:cs="Calibri"/>
+          <w:color w:val="auto"/>
+          <w:sz w:val="22"/>
+          <w:szCs w:val="22"/>
+          <w:lang w:val="en-US" w:eastAsia="en-US" w:bidi="ar-SA"/>
+        </w:rPr>
+        <w:t>Wynnie Amaral de Souza Jaques</w:t>
+      </w:r>
+    </w:p>
+    <w:p>
+      <w:pPr>
+        <w:widowControl/>
+        <w:spacing w:before="740"/>
+        <w:rPr>
+          <w:rFonts w:ascii="Times New Roman" w:eastAsia="Times New Roman" w:hAnsi="Times New Roman" w:cs="Times New Roman"/>
+          <w:color w:val="auto"/>
+          <w:sz w:val="20"/>
+          <w:szCs w:val="20"/>
+          <w:lang w:eastAsia="en-US" w:bidi="ar-SA"/>
+        </w:rPr>
+      </w:pPr>
+      <w:r>
+        <w:rPr>
+          <w:rFonts w:ascii="Calibri" w:eastAsia="Calibri" w:hAnsi="Calibri" w:cs="Calibri"/>
+          <w:color w:val="auto"/>
+          <w:sz w:val="22"/>
+          <w:szCs w:val="22"/>
+          <w:lang w:eastAsia="en-US" w:bidi="ar-SA"/>
+        </w:rPr>
+        <w:t>Agradecemos a colaboração e estamos à disposição para mais esclarecimentos.</w:t>
+      </w:r>
+    </w:p>
+    <w:p>
+      <w:pPr>
+        <w:widowControl/>
+        <w:spacing w:before="260"/>
+        <w:rPr>
+          <w:rFonts w:ascii="Times New Roman" w:eastAsia="Times New Roman" w:hAnsi="Times New Roman" w:cs="Times New Roman"/>
+          <w:color w:val="auto"/>
+          <w:sz w:val="20"/>
+          <w:szCs w:val="20"/>
+          <w:lang w:eastAsia="en-US" w:bidi="ar-SA"/>
+        </w:rPr>
+      </w:pPr>
+      <w:r>
+        <w:rPr>
+          <w:rFonts w:ascii="Calibri" w:eastAsia="Calibri" w:hAnsi="Calibri" w:cs="Calibri"/>
+          <w:color w:val="auto"/>
+          <w:sz w:val="22"/>
+          <w:szCs w:val="22"/>
+          <w:lang w:eastAsia="en-US" w:bidi="ar-SA"/>
+        </w:rPr>
+        <w:t>Atenciosamente,</w:t>
+      </w:r>
+    </w:p>
+    <w:p>
+      <w:pPr>
+        <w:spacing w:before="700" w:line="276" w:lineRule="auto"/>
+        <w:ind w:left="15" w:right="1872"/>
+        <w:jc w:val="center"/>
+        <w:rPr>
+          <w:rFonts w:ascii="Calibri" w:eastAsia="Arial Unicode MS" w:hAnsi="Calibri" w:cs="Calibri"/>
+          <w:sz w:val="22"/>
+          <w:szCs w:val="22"/>
+          <w:lang w:val="it-IT" w:bidi="ar-SA"/>
+        </w:rPr>
+      </w:pPr>
+      <w:r>
+        <w:rPr>
+          <w:rFonts w:ascii="Calibri" w:eastAsia="Arial Unicode MS" w:hAnsi="Calibri" w:cs="Calibri"/>
+          <w:sz w:val="22"/>
+          <w:szCs w:val="22"/>
+          <w:lang w:val="it-IT" w:bidi="ar-SA"/>
+        </w:rPr>
+        <w:t>[Signature]</w:t>
+      </w:r>
+    </w:p>
+    <w:p>
+      <w:pPr>
+        <w:spacing w:line="246" w:lineRule="auto"/>
+        <w:ind w:left="450" w:right="1872"/>
+        <w:jc w:val="center"/>
+        <w:rPr>
+          <w:rFonts w:ascii="Calibri" w:eastAsia="Arial Unicode MS" w:hAnsi="Calibri" w:cs="Calibri"/>
+          <w:sz w:val="22"/>
+          <w:szCs w:val="22"/>
+          <w:lang w:val="it-IT" w:bidi="ar-SA"/>
+        </w:rPr>
+      </w:pPr>
+      <w:r>
+        <w:rPr>
+          <w:rFonts w:ascii="Calibri" w:eastAsia="Arial Unicode MS" w:hAnsi="Calibri" w:cs="Calibri"/>
+          <w:sz w:val="22"/>
+          <w:szCs w:val="22"/>
+          <w:lang w:val="it-IT" w:bidi="ar-SA"/>
+        </w:rPr>
+        <w:t>_________________________________________</w:t>
+      </w:r>
+    </w:p>
+    <w:p>
+      <w:pPr>
+        <w:widowControl/>
+        <w:spacing w:before="20" w:line="220" w:lineRule="auto"/>
+        <w:ind w:right="1296"/>
+        <w:jc w:val="center"/>
+        <w:rPr>
+          <w:rFonts w:ascii="Times New Roman" w:eastAsia="Times New Roman" w:hAnsi="Times New Roman" w:cs="Times New Roman"/>
+          <w:color w:val="auto"/>
+          <w:sz w:val="20"/>
+          <w:szCs w:val="20"/>
+          <w:lang w:eastAsia="en-US" w:bidi="ar-SA"/>
+        </w:rPr>
+      </w:pPr>
+      <w:r>
+        <w:rPr>
+          <w:rFonts w:ascii="Calibri" w:eastAsia="Calibri" w:hAnsi="Calibri" w:cs="Calibri"/>
+          <w:b/>
+          <w:bCs/>
+          <w:color w:val="auto"/>
+          <w:sz w:val="22"/>
+          <w:szCs w:val="22"/>
+          <w:lang w:eastAsia="en-US" w:bidi="ar-SA"/>
+        </w:rPr>
+        <w:t>Dr. Sandro L. Reichow – CRM 6382</w:t>
+      </w:r>
+    </w:p>
+    <w:p>
+      <w:pPr>
+        <w:widowControl/>
+        <w:spacing w:line="222" w:lineRule="auto"/>
+        <w:ind w:right="1296"/>
+        <w:jc w:val="center"/>
+        <w:rPr>
+          <w:rFonts w:ascii="Times New Roman" w:eastAsia="Times New Roman" w:hAnsi="Times New Roman" w:cs="Times New Roman"/>
+          <w:color w:val="auto"/>
+          <w:sz w:val="20"/>
+          <w:szCs w:val="20"/>
+          <w:lang w:eastAsia="en-US" w:bidi="ar-SA"/>
+        </w:rPr>
+      </w:pPr>
+      <w:r>
+        <w:rPr>
+          <w:rFonts w:ascii="Calibri" w:eastAsia="Calibri" w:hAnsi="Calibri" w:cs="Calibri"/>
+          <w:b/>
+          <w:bCs/>
+          <w:color w:val="auto"/>
+          <w:sz w:val="22"/>
+          <w:szCs w:val="22"/>
+          <w:lang w:eastAsia="en-US" w:bidi="ar-SA"/>
+        </w:rPr>
+        <w:t>Investigador Principal (PI)</w:t>
+      </w:r>
+    </w:p>
+    <w:p>
+      <w:pPr>
+        <w:widowControl/>
+        <w:spacing w:line="222" w:lineRule="auto"/>
+        <w:ind w:right="1296"/>
+        <w:jc w:val="center"/>
+        <w:rPr>
+          <w:rFonts w:ascii="Times New Roman" w:eastAsia="Times New Roman" w:hAnsi="Times New Roman" w:cs="Times New Roman"/>
+          <w:color w:val="auto"/>
+          <w:sz w:val="20"/>
+          <w:szCs w:val="20"/>
+          <w:lang w:eastAsia="en-US" w:bidi="ar-SA"/>
+        </w:rPr>
+      </w:pPr>
+      <w:r>
+        <w:rPr>
+          <w:rFonts w:ascii="Calibri" w:eastAsia="Calibri" w:hAnsi="Calibri" w:cs="Calibri"/>
+          <w:b/>
+          <w:bCs/>
+          <w:color w:val="auto"/>
+          <w:sz w:val="22"/>
+          <w:szCs w:val="22"/>
+          <w:lang w:eastAsia="en-US" w:bidi="ar-SA"/>
+        </w:rPr>
+        <w:t>Centro de Ensino e Pesquisa Reichow</w:t>
       </w:r>
     </w:p>
     <w:sectPr>

</xml_diff>